<commit_message>
Update JCPV Implementation Manual.docx
Finalize the implementation manual for this segment
</commit_message>
<xml_diff>
--- a/JCPV Implementation Manual.docx
+++ b/JCPV Implementation Manual.docx
@@ -91,23 +91,7 @@
         <w:t xml:space="preserve">tracking property status and condition, </w:t>
       </w:r>
       <w:r>
-        <w:t xml:space="preserve">validating addresses, geocoding locations, and generating interactive maps for Jefferson County, PA. The system integrates </w:t>
-      </w:r>
-      <w:proofErr w:type="spellStart"/>
-      <w:r>
-        <w:t>Tkinter</w:t>
-      </w:r>
-      <w:proofErr w:type="spellEnd"/>
-      <w:r>
-        <w:t xml:space="preserve"> for the GUI, Folium for map rendering, </w:t>
-      </w:r>
-      <w:proofErr w:type="spellStart"/>
-      <w:r>
-        <w:t>GeoPandas</w:t>
-      </w:r>
-      <w:proofErr w:type="spellEnd"/>
-      <w:r>
-        <w:t xml:space="preserve"> for shapefile processing, and Selenium for automated map screenshot generation.</w:t>
+        <w:t>validating addresses, geocoding locations, and generating interactive maps for Jefferson County, PA. The system integrates Tkinter for the GUI, Folium for map rendering, GeoPandas for shapefile processing, and Selenium for automated map screenshot generation.</w:t>
       </w:r>
     </w:p>
     <w:p>
@@ -184,15 +168,7 @@
         </w:numPr>
       </w:pPr>
       <w:r>
-        <w:t>Packaging as a standalone Windows executable using auto‑</w:t>
-      </w:r>
-      <w:proofErr w:type="spellStart"/>
-      <w:r>
-        <w:t>py</w:t>
-      </w:r>
-      <w:proofErr w:type="spellEnd"/>
-      <w:r>
-        <w:t>‑to‑</w:t>
+        <w:t>Packaging as a standalone Windows executable using auto‑py‑to‑</w:t>
       </w:r>
       <w:r>
         <w:t>exe</w:t>
@@ -297,10 +273,7 @@
         </w:numPr>
       </w:pPr>
       <w:r>
-        <w:t xml:space="preserve">Operating System: </w:t>
-      </w:r>
-      <w:r>
-        <w:t xml:space="preserve">Some Windows based OS, </w:t>
+        <w:t xml:space="preserve">Operating System: Some Windows based OS, </w:t>
       </w:r>
       <w:r>
         <w:t xml:space="preserve">10 or 11 </w:t>
@@ -449,11 +422,9 @@
       <w:r>
         <w:t xml:space="preserve">pandas </w:t>
       </w:r>
-      <w:proofErr w:type="spellStart"/>
       <w:r>
         <w:t>dataframe</w:t>
       </w:r>
-      <w:proofErr w:type="spellEnd"/>
       <w:r>
         <w:t xml:space="preserve"> for managing the </w:t>
       </w:r>
@@ -469,6 +440,14 @@
     </w:p>
     <w:p>
       <w:pPr>
+        <w:pStyle w:val="Heading2"/>
+      </w:pPr>
+      <w:r>
+        <w:t xml:space="preserve">Application </w:t>
+      </w:r>
+    </w:p>
+    <w:p>
+      <w:pPr>
         <w:pStyle w:val="Heading3"/>
       </w:pPr>
       <w:r>
@@ -489,36 +468,166 @@
         </w:numPr>
       </w:pPr>
       <w:r>
-        <w:t xml:space="preserve">Extract Zip folder by </w:t>
+        <w:t>Extract Zip folder by right-clicking the file, and choosing the “Extract all…” option</w:t>
+      </w:r>
+    </w:p>
+    <w:p>
+      <w:pPr>
+        <w:pStyle w:val="ListParagraph"/>
+        <w:numPr>
+          <w:ilvl w:val="0"/>
+          <w:numId w:val="23"/>
+        </w:numPr>
+      </w:pPr>
+      <w:r>
+        <w:t>Once the .exe is extracted, make sure it has access to the resources it needs in the folders “</w:t>
       </w:r>
       <w:r>
-        <w:t xml:space="preserve">right-clicking the </w:t>
+        <w:t>\_internal\resources</w:t>
+      </w:r>
+      <w:r>
+        <w:t>”.</w:t>
+      </w:r>
+    </w:p>
+    <w:p>
+      <w:pPr>
+        <w:pStyle w:val="ListParagraph"/>
+        <w:numPr>
+          <w:ilvl w:val="0"/>
+          <w:numId w:val="23"/>
+        </w:numPr>
+      </w:pPr>
+      <w:r>
+        <w:t>Run the .exe and follow the prompts to open/create a CSV.</w:t>
       </w:r>
     </w:p>
     <w:p>
       <w:r>
-        <w:t>For further development:</w:t>
+        <w:t>For further development use:</w:t>
       </w:r>
     </w:p>
     <w:p>
       <w:pPr>
-        <w:pStyle w:val="Heading2"/>
+        <w:pStyle w:val="ListParagraph"/>
+        <w:numPr>
+          <w:ilvl w:val="0"/>
+          <w:numId w:val="24"/>
+        </w:numPr>
       </w:pPr>
       <w:r>
-        <w:t xml:space="preserve">Application </w:t>
+        <w:t>A modern python version (I used 3.13.2)</w:t>
       </w:r>
     </w:p>
     <w:p>
       <w:pPr>
-        <w:pStyle w:val="Heading3"/>
+        <w:pStyle w:val="ListParagraph"/>
+        <w:numPr>
+          <w:ilvl w:val="0"/>
+          <w:numId w:val="24"/>
+        </w:numPr>
       </w:pPr>
       <w:r>
-        <w:t>Setup</w:t>
+        <w:t>The following libraries installed:</w:t>
+      </w:r>
+      <w:r>
+        <w:br/>
+      </w:r>
+      <w:r>
+        <w:t xml:space="preserve">pip install tkinter </w:t>
       </w:r>
     </w:p>
     <w:p>
+      <w:pPr>
+        <w:pStyle w:val="ListParagraph"/>
+      </w:pPr>
       <w:r>
-        <w:t>- [Steps placeholder]</w:t>
+        <w:t xml:space="preserve">pip install pillow </w:t>
+      </w:r>
+    </w:p>
+    <w:p>
+      <w:pPr>
+        <w:pStyle w:val="ListParagraph"/>
+      </w:pPr>
+      <w:r>
+        <w:t xml:space="preserve">pip install pandas </w:t>
+      </w:r>
+    </w:p>
+    <w:p>
+      <w:pPr>
+        <w:pStyle w:val="ListParagraph"/>
+      </w:pPr>
+      <w:r>
+        <w:t xml:space="preserve">pip install requests </w:t>
+      </w:r>
+    </w:p>
+    <w:p>
+      <w:pPr>
+        <w:pStyle w:val="ListParagraph"/>
+      </w:pPr>
+      <w:r>
+        <w:t xml:space="preserve">pip install folium </w:t>
+      </w:r>
+    </w:p>
+    <w:p>
+      <w:pPr>
+        <w:pStyle w:val="ListParagraph"/>
+      </w:pPr>
+      <w:r>
+        <w:t xml:space="preserve">pip install geopandas </w:t>
+      </w:r>
+    </w:p>
+    <w:p>
+      <w:pPr>
+        <w:pStyle w:val="ListParagraph"/>
+      </w:pPr>
+      <w:r>
+        <w:t xml:space="preserve">pip install geopy </w:t>
+      </w:r>
+    </w:p>
+    <w:p>
+      <w:pPr>
+        <w:pStyle w:val="ListParagraph"/>
+      </w:pPr>
+      <w:r>
+        <w:t xml:space="preserve">pip install shapely </w:t>
+      </w:r>
+    </w:p>
+    <w:p>
+      <w:pPr>
+        <w:pStyle w:val="ListParagraph"/>
+      </w:pPr>
+      <w:r>
+        <w:t>pip install selenium</w:t>
+      </w:r>
+    </w:p>
+    <w:p>
+      <w:pPr>
+        <w:pStyle w:val="ListParagraph"/>
+        <w:numPr>
+          <w:ilvl w:val="0"/>
+          <w:numId w:val="24"/>
+        </w:numPr>
+      </w:pPr>
+      <w:r>
+        <w:t>A working version of chrome</w:t>
+      </w:r>
+    </w:p>
+    <w:p>
+      <w:pPr>
+        <w:pStyle w:val="ListParagraph"/>
+        <w:numPr>
+          <w:ilvl w:val="0"/>
+          <w:numId w:val="24"/>
+        </w:numPr>
+      </w:pPr>
+      <w:r>
+        <w:t>The shape data files in the resources folder (the code is setup to use: “P</w:t>
+      </w:r>
+      <w:r>
+        <w:t>aMunicipalities2025_07.shp"</w:t>
+      </w:r>
+      <w:r>
+        <w:t>, but if you change it, I don’t think it will break anything.)</w:t>
       </w:r>
     </w:p>
     <w:p>
@@ -531,7 +640,7 @@
     </w:p>
     <w:p>
       <w:r>
-        <w:t>- [Config file placeholders]</w:t>
+        <w:t>At the current time writing this, settings and configs are being worked on right now.</w:t>
       </w:r>
     </w:p>
     <w:p>
@@ -543,21 +652,177 @@
       </w:r>
     </w:p>
     <w:p>
+      <w:pPr>
+        <w:pStyle w:val="ListParagraph"/>
+        <w:numPr>
+          <w:ilvl w:val="0"/>
+          <w:numId w:val="26"/>
+        </w:numPr>
+      </w:pPr>
       <w:r>
-        <w:t>- [Default accounts, settings placeholders]</w:t>
+        <w:t>Default geocoder: Nominatim (OpenStreetMap)</w:t>
       </w:r>
     </w:p>
     <w:p>
       <w:pPr>
+        <w:numPr>
+          <w:ilvl w:val="0"/>
+          <w:numId w:val="26"/>
+        </w:numPr>
+      </w:pPr>
+      <w:r>
+        <w:t>Default map center: Jefferson County, PA</w:t>
+      </w:r>
+    </w:p>
+    <w:p>
+      <w:pPr>
+        <w:numPr>
+          <w:ilvl w:val="0"/>
+          <w:numId w:val="26"/>
+        </w:numPr>
+      </w:pPr>
+      <w:r>
+        <w:t>Default zoom: 10</w:t>
+      </w:r>
+    </w:p>
+    <w:p>
+      <w:pPr>
+        <w:numPr>
+          <w:ilvl w:val="0"/>
+          <w:numId w:val="26"/>
+        </w:numPr>
+      </w:pPr>
+      <w:r>
+        <w:t>Default output directory: Application root</w:t>
+      </w:r>
+    </w:p>
+    <w:p/>
+    <w:p>
+      <w:pPr>
         <w:pStyle w:val="Heading1"/>
       </w:pPr>
       <w:r>
+        <w:lastRenderedPageBreak/>
         <w:t>User Guide</w:t>
       </w:r>
     </w:p>
     <w:p>
+      <w:pPr>
+        <w:pStyle w:val="Heading2"/>
+      </w:pPr>
       <w:r>
-        <w:t>- [Link or location placeholder]</w:t>
+        <w:t>Launching the Application</w:t>
+      </w:r>
+    </w:p>
+    <w:p>
+      <w:r>
+        <w:t>-</w:t>
+      </w:r>
+      <w:r>
+        <w:t xml:space="preserve"> </w:t>
+      </w:r>
+      <w:r>
+        <w:t>Double‑click the packaged .exe</w:t>
+      </w:r>
+    </w:p>
+    <w:p>
+      <w:r>
+        <w:t>- No installation required</w:t>
+      </w:r>
+      <w:r>
+        <w:t>, just extraction from the zip file</w:t>
+      </w:r>
+    </w:p>
+    <w:p>
+      <w:pPr>
+        <w:pStyle w:val="Heading2"/>
+      </w:pPr>
+      <w:r>
+        <w:t>Typical Workflow</w:t>
+      </w:r>
+    </w:p>
+    <w:p>
+      <w:r>
+        <w:t>- Load a CSV file</w:t>
+      </w:r>
+    </w:p>
+    <w:p>
+      <w:r>
+        <w:t>- Sort the list of properties</w:t>
+      </w:r>
+    </w:p>
+    <w:p>
+      <w:r>
+        <w:t xml:space="preserve">- </w:t>
+      </w:r>
+      <w:r>
+        <w:t>Select</w:t>
+      </w:r>
+      <w:r>
+        <w:t xml:space="preserve"> a property from the list</w:t>
+      </w:r>
+    </w:p>
+    <w:p>
+      <w:r>
+        <w:t>- Data about the property, any images, and a map will be displayed in a new window</w:t>
+      </w:r>
+    </w:p>
+    <w:p>
+      <w:r>
+        <w:t>- Modify the data or leave a note</w:t>
+      </w:r>
+    </w:p>
+    <w:p>
+      <w:r>
+        <w:t>- Create a new property by filling out t</w:t>
+      </w:r>
+      <w:r>
+        <w:t>he form from the ‘new’ button</w:t>
+      </w:r>
+    </w:p>
+    <w:p>
+      <w:r>
+        <w:t>- Delete an entry</w:t>
+      </w:r>
+    </w:p>
+    <w:p>
+      <w:r>
+        <w:t>- Export updated CSV</w:t>
+      </w:r>
+    </w:p>
+    <w:p>
+      <w:pPr>
+        <w:pStyle w:val="Heading2"/>
+      </w:pPr>
+      <w:r>
+        <w:t>Map Generation</w:t>
+      </w:r>
+    </w:p>
+    <w:p>
+      <w:r>
+        <w:t>- Individual Map: Uses create_map()</w:t>
+      </w:r>
+      <w:r>
+        <w:t xml:space="preserve">, runs when a property is selected. Will use a previously generated map unless the checkbox for </w:t>
+      </w:r>
+      <w:r>
+        <w:t>regen maps is selected</w:t>
+      </w:r>
+    </w:p>
+    <w:p>
+      <w:r>
+        <w:t>- Full Map: Uses generate_full_map()</w:t>
+      </w:r>
+      <w:r>
+        <w:t>, runs when the full map button is pressed</w:t>
+      </w:r>
+      <w:r>
+        <w:t>, always generates a new map, to ensure that no changes to the data were missed</w:t>
+      </w:r>
+    </w:p>
+    <w:p>
+      <w:r>
+        <w:t>- Selenium captures a PNG screenshot for embedding in Tkinter</w:t>
       </w:r>
     </w:p>
     <w:p>
@@ -569,8 +834,63 @@
       </w:r>
     </w:p>
     <w:p>
+      <w:pPr>
+        <w:pStyle w:val="Heading2"/>
+      </w:pPr>
       <w:r>
-        <w:t>- [Additional notes placeholder]</w:t>
+        <w:t>Notes</w:t>
+      </w:r>
+    </w:p>
+    <w:p>
+      <w:pPr>
+        <w:pStyle w:val="ListParagraph"/>
+        <w:numPr>
+          <w:ilvl w:val="0"/>
+          <w:numId w:val="30"/>
+        </w:numPr>
+      </w:pPr>
+      <w:r>
+        <w:t>Geocoding is rate</w:t>
+      </w:r>
+      <w:r>
+        <w:noBreakHyphen/>
+        <w:t>limited; the application includes delays to avoid API throttling</w:t>
+      </w:r>
+    </w:p>
+    <w:p>
+      <w:pPr>
+        <w:pStyle w:val="ListParagraph"/>
+        <w:numPr>
+          <w:ilvl w:val="0"/>
+          <w:numId w:val="30"/>
+        </w:numPr>
+      </w:pPr>
+      <w:r>
+        <w:t>Selenium requires ChromeDriver to match the installed Chrome version</w:t>
+      </w:r>
+      <w:r>
+        <w:t xml:space="preserve"> </w:t>
+      </w:r>
+    </w:p>
+    <w:p>
+      <w:pPr>
+        <w:pStyle w:val="ListParagraph"/>
+        <w:numPr>
+          <w:ilvl w:val="0"/>
+          <w:numId w:val="30"/>
+        </w:numPr>
+      </w:pPr>
+      <w:r>
+        <w:t>Shapefile must remain intact with all associated .shx, .dbf, .prj files</w:t>
+      </w:r>
+      <w:r>
+        <w:t xml:space="preserve"> (everything you need will be in the resources folder, </w:t>
+      </w:r>
+      <w:r>
+        <w:t>or _internal/resources if it’s the packaged version</w:t>
+      </w:r>
+      <w:r>
+        <w:t>)</w:t>
       </w:r>
     </w:p>
     <w:sectPr>
@@ -757,6 +1077,155 @@
     </w:lvl>
   </w:abstractNum>
   <w:abstractNum w:abstractNumId="9" w15:restartNumberingAfterBreak="0">
+    <w:nsid w:val="06C56528"/>
+    <w:multiLevelType w:val="multilevel"/>
+    <w:tmpl w:val="E7E60C66"/>
+    <w:lvl w:ilvl="0">
+      <w:start w:val="1"/>
+      <w:numFmt w:val="bullet"/>
+      <w:lvlText w:val=""/>
+      <w:lvlJc w:val="left"/>
+      <w:pPr>
+        <w:tabs>
+          <w:tab w:val="num" w:pos="720"/>
+        </w:tabs>
+        <w:ind w:left="720" w:hanging="360"/>
+      </w:pPr>
+      <w:rPr>
+        <w:rFonts w:ascii="Symbol" w:hAnsi="Symbol" w:hint="default"/>
+        <w:sz w:val="20"/>
+      </w:rPr>
+    </w:lvl>
+    <w:lvl w:ilvl="1" w:tentative="1">
+      <w:start w:val="1"/>
+      <w:numFmt w:val="bullet"/>
+      <w:lvlText w:val="o"/>
+      <w:lvlJc w:val="left"/>
+      <w:pPr>
+        <w:tabs>
+          <w:tab w:val="num" w:pos="1440"/>
+        </w:tabs>
+        <w:ind w:left="1440" w:hanging="360"/>
+      </w:pPr>
+      <w:rPr>
+        <w:rFonts w:ascii="Courier New" w:hAnsi="Courier New" w:hint="default"/>
+        <w:sz w:val="20"/>
+      </w:rPr>
+    </w:lvl>
+    <w:lvl w:ilvl="2" w:tentative="1">
+      <w:start w:val="1"/>
+      <w:numFmt w:val="bullet"/>
+      <w:lvlText w:val=""/>
+      <w:lvlJc w:val="left"/>
+      <w:pPr>
+        <w:tabs>
+          <w:tab w:val="num" w:pos="2160"/>
+        </w:tabs>
+        <w:ind w:left="2160" w:hanging="360"/>
+      </w:pPr>
+      <w:rPr>
+        <w:rFonts w:ascii="Wingdings" w:hAnsi="Wingdings" w:hint="default"/>
+        <w:sz w:val="20"/>
+      </w:rPr>
+    </w:lvl>
+    <w:lvl w:ilvl="3" w:tentative="1">
+      <w:start w:val="1"/>
+      <w:numFmt w:val="bullet"/>
+      <w:lvlText w:val=""/>
+      <w:lvlJc w:val="left"/>
+      <w:pPr>
+        <w:tabs>
+          <w:tab w:val="num" w:pos="2880"/>
+        </w:tabs>
+        <w:ind w:left="2880" w:hanging="360"/>
+      </w:pPr>
+      <w:rPr>
+        <w:rFonts w:ascii="Wingdings" w:hAnsi="Wingdings" w:hint="default"/>
+        <w:sz w:val="20"/>
+      </w:rPr>
+    </w:lvl>
+    <w:lvl w:ilvl="4" w:tentative="1">
+      <w:start w:val="1"/>
+      <w:numFmt w:val="bullet"/>
+      <w:lvlText w:val=""/>
+      <w:lvlJc w:val="left"/>
+      <w:pPr>
+        <w:tabs>
+          <w:tab w:val="num" w:pos="3600"/>
+        </w:tabs>
+        <w:ind w:left="3600" w:hanging="360"/>
+      </w:pPr>
+      <w:rPr>
+        <w:rFonts w:ascii="Wingdings" w:hAnsi="Wingdings" w:hint="default"/>
+        <w:sz w:val="20"/>
+      </w:rPr>
+    </w:lvl>
+    <w:lvl w:ilvl="5" w:tentative="1">
+      <w:start w:val="1"/>
+      <w:numFmt w:val="bullet"/>
+      <w:lvlText w:val=""/>
+      <w:lvlJc w:val="left"/>
+      <w:pPr>
+        <w:tabs>
+          <w:tab w:val="num" w:pos="4320"/>
+        </w:tabs>
+        <w:ind w:left="4320" w:hanging="360"/>
+      </w:pPr>
+      <w:rPr>
+        <w:rFonts w:ascii="Wingdings" w:hAnsi="Wingdings" w:hint="default"/>
+        <w:sz w:val="20"/>
+      </w:rPr>
+    </w:lvl>
+    <w:lvl w:ilvl="6" w:tentative="1">
+      <w:start w:val="1"/>
+      <w:numFmt w:val="bullet"/>
+      <w:lvlText w:val=""/>
+      <w:lvlJc w:val="left"/>
+      <w:pPr>
+        <w:tabs>
+          <w:tab w:val="num" w:pos="5040"/>
+        </w:tabs>
+        <w:ind w:left="5040" w:hanging="360"/>
+      </w:pPr>
+      <w:rPr>
+        <w:rFonts w:ascii="Wingdings" w:hAnsi="Wingdings" w:hint="default"/>
+        <w:sz w:val="20"/>
+      </w:rPr>
+    </w:lvl>
+    <w:lvl w:ilvl="7" w:tentative="1">
+      <w:start w:val="1"/>
+      <w:numFmt w:val="bullet"/>
+      <w:lvlText w:val=""/>
+      <w:lvlJc w:val="left"/>
+      <w:pPr>
+        <w:tabs>
+          <w:tab w:val="num" w:pos="5760"/>
+        </w:tabs>
+        <w:ind w:left="5760" w:hanging="360"/>
+      </w:pPr>
+      <w:rPr>
+        <w:rFonts w:ascii="Wingdings" w:hAnsi="Wingdings" w:hint="default"/>
+        <w:sz w:val="20"/>
+      </w:rPr>
+    </w:lvl>
+    <w:lvl w:ilvl="8" w:tentative="1">
+      <w:start w:val="1"/>
+      <w:numFmt w:val="bullet"/>
+      <w:lvlText w:val=""/>
+      <w:lvlJc w:val="left"/>
+      <w:pPr>
+        <w:tabs>
+          <w:tab w:val="num" w:pos="6480"/>
+        </w:tabs>
+        <w:ind w:left="6480" w:hanging="360"/>
+      </w:pPr>
+      <w:rPr>
+        <w:rFonts w:ascii="Wingdings" w:hAnsi="Wingdings" w:hint="default"/>
+        <w:sz w:val="20"/>
+      </w:rPr>
+    </w:lvl>
+  </w:abstractNum>
+  <w:abstractNum w:abstractNumId="10" w15:restartNumberingAfterBreak="0">
     <w:nsid w:val="0BAE39D3"/>
     <w:multiLevelType w:val="hybridMultilevel"/>
     <w:tmpl w:val="324A95DA"/>
@@ -869,7 +1338,7 @@
       </w:rPr>
     </w:lvl>
   </w:abstractNum>
-  <w:abstractNum w:abstractNumId="10" w15:restartNumberingAfterBreak="0">
+  <w:abstractNum w:abstractNumId="11" w15:restartNumberingAfterBreak="0">
     <w:nsid w:val="1687768B"/>
     <w:multiLevelType w:val="hybridMultilevel"/>
     <w:tmpl w:val="E73EB632"/>
@@ -982,7 +1451,7 @@
       </w:rPr>
     </w:lvl>
   </w:abstractNum>
-  <w:abstractNum w:abstractNumId="11" w15:restartNumberingAfterBreak="0">
+  <w:abstractNum w:abstractNumId="12" w15:restartNumberingAfterBreak="0">
     <w:nsid w:val="1BF674D5"/>
     <w:multiLevelType w:val="hybridMultilevel"/>
     <w:tmpl w:val="A7C852A6"/>
@@ -1068,7 +1537,120 @@
       </w:pPr>
     </w:lvl>
   </w:abstractNum>
-  <w:abstractNum w:abstractNumId="12" w15:restartNumberingAfterBreak="0">
+  <w:abstractNum w:abstractNumId="13" w15:restartNumberingAfterBreak="0">
+    <w:nsid w:val="229B3EF9"/>
+    <w:multiLevelType w:val="hybridMultilevel"/>
+    <w:tmpl w:val="46B2A2A2"/>
+    <w:lvl w:ilvl="0" w:tplc="04090001">
+      <w:start w:val="1"/>
+      <w:numFmt w:val="bullet"/>
+      <w:lvlText w:val=""/>
+      <w:lvlJc w:val="left"/>
+      <w:pPr>
+        <w:ind w:left="720" w:hanging="360"/>
+      </w:pPr>
+      <w:rPr>
+        <w:rFonts w:ascii="Symbol" w:hAnsi="Symbol" w:hint="default"/>
+      </w:rPr>
+    </w:lvl>
+    <w:lvl w:ilvl="1" w:tplc="04090003" w:tentative="1">
+      <w:start w:val="1"/>
+      <w:numFmt w:val="bullet"/>
+      <w:lvlText w:val="o"/>
+      <w:lvlJc w:val="left"/>
+      <w:pPr>
+        <w:ind w:left="1440" w:hanging="360"/>
+      </w:pPr>
+      <w:rPr>
+        <w:rFonts w:ascii="Courier New" w:hAnsi="Courier New" w:cs="Courier New" w:hint="default"/>
+      </w:rPr>
+    </w:lvl>
+    <w:lvl w:ilvl="2" w:tplc="04090005" w:tentative="1">
+      <w:start w:val="1"/>
+      <w:numFmt w:val="bullet"/>
+      <w:lvlText w:val=""/>
+      <w:lvlJc w:val="left"/>
+      <w:pPr>
+        <w:ind w:left="2160" w:hanging="360"/>
+      </w:pPr>
+      <w:rPr>
+        <w:rFonts w:ascii="Wingdings" w:hAnsi="Wingdings" w:hint="default"/>
+      </w:rPr>
+    </w:lvl>
+    <w:lvl w:ilvl="3" w:tplc="04090001" w:tentative="1">
+      <w:start w:val="1"/>
+      <w:numFmt w:val="bullet"/>
+      <w:lvlText w:val=""/>
+      <w:lvlJc w:val="left"/>
+      <w:pPr>
+        <w:ind w:left="2880" w:hanging="360"/>
+      </w:pPr>
+      <w:rPr>
+        <w:rFonts w:ascii="Symbol" w:hAnsi="Symbol" w:hint="default"/>
+      </w:rPr>
+    </w:lvl>
+    <w:lvl w:ilvl="4" w:tplc="04090003" w:tentative="1">
+      <w:start w:val="1"/>
+      <w:numFmt w:val="bullet"/>
+      <w:lvlText w:val="o"/>
+      <w:lvlJc w:val="left"/>
+      <w:pPr>
+        <w:ind w:left="3600" w:hanging="360"/>
+      </w:pPr>
+      <w:rPr>
+        <w:rFonts w:ascii="Courier New" w:hAnsi="Courier New" w:cs="Courier New" w:hint="default"/>
+      </w:rPr>
+    </w:lvl>
+    <w:lvl w:ilvl="5" w:tplc="04090005" w:tentative="1">
+      <w:start w:val="1"/>
+      <w:numFmt w:val="bullet"/>
+      <w:lvlText w:val=""/>
+      <w:lvlJc w:val="left"/>
+      <w:pPr>
+        <w:ind w:left="4320" w:hanging="360"/>
+      </w:pPr>
+      <w:rPr>
+        <w:rFonts w:ascii="Wingdings" w:hAnsi="Wingdings" w:hint="default"/>
+      </w:rPr>
+    </w:lvl>
+    <w:lvl w:ilvl="6" w:tplc="04090001" w:tentative="1">
+      <w:start w:val="1"/>
+      <w:numFmt w:val="bullet"/>
+      <w:lvlText w:val=""/>
+      <w:lvlJc w:val="left"/>
+      <w:pPr>
+        <w:ind w:left="5040" w:hanging="360"/>
+      </w:pPr>
+      <w:rPr>
+        <w:rFonts w:ascii="Symbol" w:hAnsi="Symbol" w:hint="default"/>
+      </w:rPr>
+    </w:lvl>
+    <w:lvl w:ilvl="7" w:tplc="04090003" w:tentative="1">
+      <w:start w:val="1"/>
+      <w:numFmt w:val="bullet"/>
+      <w:lvlText w:val="o"/>
+      <w:lvlJc w:val="left"/>
+      <w:pPr>
+        <w:ind w:left="5760" w:hanging="360"/>
+      </w:pPr>
+      <w:rPr>
+        <w:rFonts w:ascii="Courier New" w:hAnsi="Courier New" w:cs="Courier New" w:hint="default"/>
+      </w:rPr>
+    </w:lvl>
+    <w:lvl w:ilvl="8" w:tplc="04090005" w:tentative="1">
+      <w:start w:val="1"/>
+      <w:numFmt w:val="bullet"/>
+      <w:lvlText w:val=""/>
+      <w:lvlJc w:val="left"/>
+      <w:pPr>
+        <w:ind w:left="6480" w:hanging="360"/>
+      </w:pPr>
+      <w:rPr>
+        <w:rFonts w:ascii="Wingdings" w:hAnsi="Wingdings" w:hint="default"/>
+      </w:rPr>
+    </w:lvl>
+  </w:abstractNum>
+  <w:abstractNum w:abstractNumId="14" w15:restartNumberingAfterBreak="0">
     <w:nsid w:val="25BA101D"/>
     <w:multiLevelType w:val="hybridMultilevel"/>
     <w:tmpl w:val="C2500BFA"/>
@@ -1181,7 +1763,468 @@
       </w:rPr>
     </w:lvl>
   </w:abstractNum>
-  <w:abstractNum w:abstractNumId="13" w15:restartNumberingAfterBreak="0">
+  <w:abstractNum w:abstractNumId="15" w15:restartNumberingAfterBreak="0">
+    <w:nsid w:val="4C9837C3"/>
+    <w:multiLevelType w:val="hybridMultilevel"/>
+    <w:tmpl w:val="081098D8"/>
+    <w:lvl w:ilvl="0" w:tplc="04090001">
+      <w:start w:val="1"/>
+      <w:numFmt w:val="bullet"/>
+      <w:lvlText w:val=""/>
+      <w:lvlJc w:val="left"/>
+      <w:pPr>
+        <w:ind w:left="1080" w:hanging="360"/>
+      </w:pPr>
+      <w:rPr>
+        <w:rFonts w:ascii="Symbol" w:hAnsi="Symbol" w:hint="default"/>
+      </w:rPr>
+    </w:lvl>
+    <w:lvl w:ilvl="1" w:tplc="04090003" w:tentative="1">
+      <w:start w:val="1"/>
+      <w:numFmt w:val="bullet"/>
+      <w:lvlText w:val="o"/>
+      <w:lvlJc w:val="left"/>
+      <w:pPr>
+        <w:ind w:left="1800" w:hanging="360"/>
+      </w:pPr>
+      <w:rPr>
+        <w:rFonts w:ascii="Courier New" w:hAnsi="Courier New" w:cs="Courier New" w:hint="default"/>
+      </w:rPr>
+    </w:lvl>
+    <w:lvl w:ilvl="2" w:tplc="04090005" w:tentative="1">
+      <w:start w:val="1"/>
+      <w:numFmt w:val="bullet"/>
+      <w:lvlText w:val=""/>
+      <w:lvlJc w:val="left"/>
+      <w:pPr>
+        <w:ind w:left="2520" w:hanging="360"/>
+      </w:pPr>
+      <w:rPr>
+        <w:rFonts w:ascii="Wingdings" w:hAnsi="Wingdings" w:hint="default"/>
+      </w:rPr>
+    </w:lvl>
+    <w:lvl w:ilvl="3" w:tplc="04090001" w:tentative="1">
+      <w:start w:val="1"/>
+      <w:numFmt w:val="bullet"/>
+      <w:lvlText w:val=""/>
+      <w:lvlJc w:val="left"/>
+      <w:pPr>
+        <w:ind w:left="3240" w:hanging="360"/>
+      </w:pPr>
+      <w:rPr>
+        <w:rFonts w:ascii="Symbol" w:hAnsi="Symbol" w:hint="default"/>
+      </w:rPr>
+    </w:lvl>
+    <w:lvl w:ilvl="4" w:tplc="04090003" w:tentative="1">
+      <w:start w:val="1"/>
+      <w:numFmt w:val="bullet"/>
+      <w:lvlText w:val="o"/>
+      <w:lvlJc w:val="left"/>
+      <w:pPr>
+        <w:ind w:left="3960" w:hanging="360"/>
+      </w:pPr>
+      <w:rPr>
+        <w:rFonts w:ascii="Courier New" w:hAnsi="Courier New" w:cs="Courier New" w:hint="default"/>
+      </w:rPr>
+    </w:lvl>
+    <w:lvl w:ilvl="5" w:tplc="04090005" w:tentative="1">
+      <w:start w:val="1"/>
+      <w:numFmt w:val="bullet"/>
+      <w:lvlText w:val=""/>
+      <w:lvlJc w:val="left"/>
+      <w:pPr>
+        <w:ind w:left="4680" w:hanging="360"/>
+      </w:pPr>
+      <w:rPr>
+        <w:rFonts w:ascii="Wingdings" w:hAnsi="Wingdings" w:hint="default"/>
+      </w:rPr>
+    </w:lvl>
+    <w:lvl w:ilvl="6" w:tplc="04090001" w:tentative="1">
+      <w:start w:val="1"/>
+      <w:numFmt w:val="bullet"/>
+      <w:lvlText w:val=""/>
+      <w:lvlJc w:val="left"/>
+      <w:pPr>
+        <w:ind w:left="5400" w:hanging="360"/>
+      </w:pPr>
+      <w:rPr>
+        <w:rFonts w:ascii="Symbol" w:hAnsi="Symbol" w:hint="default"/>
+      </w:rPr>
+    </w:lvl>
+    <w:lvl w:ilvl="7" w:tplc="04090003" w:tentative="1">
+      <w:start w:val="1"/>
+      <w:numFmt w:val="bullet"/>
+      <w:lvlText w:val="o"/>
+      <w:lvlJc w:val="left"/>
+      <w:pPr>
+        <w:ind w:left="6120" w:hanging="360"/>
+      </w:pPr>
+      <w:rPr>
+        <w:rFonts w:ascii="Courier New" w:hAnsi="Courier New" w:cs="Courier New" w:hint="default"/>
+      </w:rPr>
+    </w:lvl>
+    <w:lvl w:ilvl="8" w:tplc="04090005" w:tentative="1">
+      <w:start w:val="1"/>
+      <w:numFmt w:val="bullet"/>
+      <w:lvlText w:val=""/>
+      <w:lvlJc w:val="left"/>
+      <w:pPr>
+        <w:ind w:left="6840" w:hanging="360"/>
+      </w:pPr>
+      <w:rPr>
+        <w:rFonts w:ascii="Wingdings" w:hAnsi="Wingdings" w:hint="default"/>
+      </w:rPr>
+    </w:lvl>
+  </w:abstractNum>
+  <w:abstractNum w:abstractNumId="16" w15:restartNumberingAfterBreak="0">
+    <w:nsid w:val="518A5A1F"/>
+    <w:multiLevelType w:val="multilevel"/>
+    <w:tmpl w:val="290E7A80"/>
+    <w:lvl w:ilvl="0">
+      <w:start w:val="1"/>
+      <w:numFmt w:val="bullet"/>
+      <w:lvlText w:val=""/>
+      <w:lvlJc w:val="left"/>
+      <w:pPr>
+        <w:tabs>
+          <w:tab w:val="num" w:pos="720"/>
+        </w:tabs>
+        <w:ind w:left="720" w:hanging="360"/>
+      </w:pPr>
+      <w:rPr>
+        <w:rFonts w:ascii="Symbol" w:hAnsi="Symbol" w:hint="default"/>
+        <w:sz w:val="20"/>
+      </w:rPr>
+    </w:lvl>
+    <w:lvl w:ilvl="1" w:tentative="1">
+      <w:start w:val="1"/>
+      <w:numFmt w:val="bullet"/>
+      <w:lvlText w:val="o"/>
+      <w:lvlJc w:val="left"/>
+      <w:pPr>
+        <w:tabs>
+          <w:tab w:val="num" w:pos="1440"/>
+        </w:tabs>
+        <w:ind w:left="1440" w:hanging="360"/>
+      </w:pPr>
+      <w:rPr>
+        <w:rFonts w:ascii="Courier New" w:hAnsi="Courier New" w:hint="default"/>
+        <w:sz w:val="20"/>
+      </w:rPr>
+    </w:lvl>
+    <w:lvl w:ilvl="2" w:tentative="1">
+      <w:start w:val="1"/>
+      <w:numFmt w:val="bullet"/>
+      <w:lvlText w:val=""/>
+      <w:lvlJc w:val="left"/>
+      <w:pPr>
+        <w:tabs>
+          <w:tab w:val="num" w:pos="2160"/>
+        </w:tabs>
+        <w:ind w:left="2160" w:hanging="360"/>
+      </w:pPr>
+      <w:rPr>
+        <w:rFonts w:ascii="Wingdings" w:hAnsi="Wingdings" w:hint="default"/>
+        <w:sz w:val="20"/>
+      </w:rPr>
+    </w:lvl>
+    <w:lvl w:ilvl="3" w:tentative="1">
+      <w:start w:val="1"/>
+      <w:numFmt w:val="bullet"/>
+      <w:lvlText w:val=""/>
+      <w:lvlJc w:val="left"/>
+      <w:pPr>
+        <w:tabs>
+          <w:tab w:val="num" w:pos="2880"/>
+        </w:tabs>
+        <w:ind w:left="2880" w:hanging="360"/>
+      </w:pPr>
+      <w:rPr>
+        <w:rFonts w:ascii="Wingdings" w:hAnsi="Wingdings" w:hint="default"/>
+        <w:sz w:val="20"/>
+      </w:rPr>
+    </w:lvl>
+    <w:lvl w:ilvl="4" w:tentative="1">
+      <w:start w:val="1"/>
+      <w:numFmt w:val="bullet"/>
+      <w:lvlText w:val=""/>
+      <w:lvlJc w:val="left"/>
+      <w:pPr>
+        <w:tabs>
+          <w:tab w:val="num" w:pos="3600"/>
+        </w:tabs>
+        <w:ind w:left="3600" w:hanging="360"/>
+      </w:pPr>
+      <w:rPr>
+        <w:rFonts w:ascii="Wingdings" w:hAnsi="Wingdings" w:hint="default"/>
+        <w:sz w:val="20"/>
+      </w:rPr>
+    </w:lvl>
+    <w:lvl w:ilvl="5" w:tentative="1">
+      <w:start w:val="1"/>
+      <w:numFmt w:val="bullet"/>
+      <w:lvlText w:val=""/>
+      <w:lvlJc w:val="left"/>
+      <w:pPr>
+        <w:tabs>
+          <w:tab w:val="num" w:pos="4320"/>
+        </w:tabs>
+        <w:ind w:left="4320" w:hanging="360"/>
+      </w:pPr>
+      <w:rPr>
+        <w:rFonts w:ascii="Wingdings" w:hAnsi="Wingdings" w:hint="default"/>
+        <w:sz w:val="20"/>
+      </w:rPr>
+    </w:lvl>
+    <w:lvl w:ilvl="6" w:tentative="1">
+      <w:start w:val="1"/>
+      <w:numFmt w:val="bullet"/>
+      <w:lvlText w:val=""/>
+      <w:lvlJc w:val="left"/>
+      <w:pPr>
+        <w:tabs>
+          <w:tab w:val="num" w:pos="5040"/>
+        </w:tabs>
+        <w:ind w:left="5040" w:hanging="360"/>
+      </w:pPr>
+      <w:rPr>
+        <w:rFonts w:ascii="Wingdings" w:hAnsi="Wingdings" w:hint="default"/>
+        <w:sz w:val="20"/>
+      </w:rPr>
+    </w:lvl>
+    <w:lvl w:ilvl="7" w:tentative="1">
+      <w:start w:val="1"/>
+      <w:numFmt w:val="bullet"/>
+      <w:lvlText w:val=""/>
+      <w:lvlJc w:val="left"/>
+      <w:pPr>
+        <w:tabs>
+          <w:tab w:val="num" w:pos="5760"/>
+        </w:tabs>
+        <w:ind w:left="5760" w:hanging="360"/>
+      </w:pPr>
+      <w:rPr>
+        <w:rFonts w:ascii="Wingdings" w:hAnsi="Wingdings" w:hint="default"/>
+        <w:sz w:val="20"/>
+      </w:rPr>
+    </w:lvl>
+    <w:lvl w:ilvl="8" w:tentative="1">
+      <w:start w:val="1"/>
+      <w:numFmt w:val="bullet"/>
+      <w:lvlText w:val=""/>
+      <w:lvlJc w:val="left"/>
+      <w:pPr>
+        <w:tabs>
+          <w:tab w:val="num" w:pos="6480"/>
+        </w:tabs>
+        <w:ind w:left="6480" w:hanging="360"/>
+      </w:pPr>
+      <w:rPr>
+        <w:rFonts w:ascii="Wingdings" w:hAnsi="Wingdings" w:hint="default"/>
+        <w:sz w:val="20"/>
+      </w:rPr>
+    </w:lvl>
+  </w:abstractNum>
+  <w:abstractNum w:abstractNumId="17" w15:restartNumberingAfterBreak="0">
+    <w:nsid w:val="52000B74"/>
+    <w:multiLevelType w:val="hybridMultilevel"/>
+    <w:tmpl w:val="2A960D54"/>
+    <w:lvl w:ilvl="0" w:tplc="04090001">
+      <w:start w:val="1"/>
+      <w:numFmt w:val="bullet"/>
+      <w:lvlText w:val=""/>
+      <w:lvlJc w:val="left"/>
+      <w:pPr>
+        <w:ind w:left="720" w:hanging="360"/>
+      </w:pPr>
+      <w:rPr>
+        <w:rFonts w:ascii="Symbol" w:hAnsi="Symbol" w:hint="default"/>
+      </w:rPr>
+    </w:lvl>
+    <w:lvl w:ilvl="1" w:tplc="04090003" w:tentative="1">
+      <w:start w:val="1"/>
+      <w:numFmt w:val="bullet"/>
+      <w:lvlText w:val="o"/>
+      <w:lvlJc w:val="left"/>
+      <w:pPr>
+        <w:ind w:left="1440" w:hanging="360"/>
+      </w:pPr>
+      <w:rPr>
+        <w:rFonts w:ascii="Courier New" w:hAnsi="Courier New" w:cs="Courier New" w:hint="default"/>
+      </w:rPr>
+    </w:lvl>
+    <w:lvl w:ilvl="2" w:tplc="04090005" w:tentative="1">
+      <w:start w:val="1"/>
+      <w:numFmt w:val="bullet"/>
+      <w:lvlText w:val=""/>
+      <w:lvlJc w:val="left"/>
+      <w:pPr>
+        <w:ind w:left="2160" w:hanging="360"/>
+      </w:pPr>
+      <w:rPr>
+        <w:rFonts w:ascii="Wingdings" w:hAnsi="Wingdings" w:hint="default"/>
+      </w:rPr>
+    </w:lvl>
+    <w:lvl w:ilvl="3" w:tplc="04090001" w:tentative="1">
+      <w:start w:val="1"/>
+      <w:numFmt w:val="bullet"/>
+      <w:lvlText w:val=""/>
+      <w:lvlJc w:val="left"/>
+      <w:pPr>
+        <w:ind w:left="2880" w:hanging="360"/>
+      </w:pPr>
+      <w:rPr>
+        <w:rFonts w:ascii="Symbol" w:hAnsi="Symbol" w:hint="default"/>
+      </w:rPr>
+    </w:lvl>
+    <w:lvl w:ilvl="4" w:tplc="04090003" w:tentative="1">
+      <w:start w:val="1"/>
+      <w:numFmt w:val="bullet"/>
+      <w:lvlText w:val="o"/>
+      <w:lvlJc w:val="left"/>
+      <w:pPr>
+        <w:ind w:left="3600" w:hanging="360"/>
+      </w:pPr>
+      <w:rPr>
+        <w:rFonts w:ascii="Courier New" w:hAnsi="Courier New" w:cs="Courier New" w:hint="default"/>
+      </w:rPr>
+    </w:lvl>
+    <w:lvl w:ilvl="5" w:tplc="04090005" w:tentative="1">
+      <w:start w:val="1"/>
+      <w:numFmt w:val="bullet"/>
+      <w:lvlText w:val=""/>
+      <w:lvlJc w:val="left"/>
+      <w:pPr>
+        <w:ind w:left="4320" w:hanging="360"/>
+      </w:pPr>
+      <w:rPr>
+        <w:rFonts w:ascii="Wingdings" w:hAnsi="Wingdings" w:hint="default"/>
+      </w:rPr>
+    </w:lvl>
+    <w:lvl w:ilvl="6" w:tplc="04090001" w:tentative="1">
+      <w:start w:val="1"/>
+      <w:numFmt w:val="bullet"/>
+      <w:lvlText w:val=""/>
+      <w:lvlJc w:val="left"/>
+      <w:pPr>
+        <w:ind w:left="5040" w:hanging="360"/>
+      </w:pPr>
+      <w:rPr>
+        <w:rFonts w:ascii="Symbol" w:hAnsi="Symbol" w:hint="default"/>
+      </w:rPr>
+    </w:lvl>
+    <w:lvl w:ilvl="7" w:tplc="04090003" w:tentative="1">
+      <w:start w:val="1"/>
+      <w:numFmt w:val="bullet"/>
+      <w:lvlText w:val="o"/>
+      <w:lvlJc w:val="left"/>
+      <w:pPr>
+        <w:ind w:left="5760" w:hanging="360"/>
+      </w:pPr>
+      <w:rPr>
+        <w:rFonts w:ascii="Courier New" w:hAnsi="Courier New" w:cs="Courier New" w:hint="default"/>
+      </w:rPr>
+    </w:lvl>
+    <w:lvl w:ilvl="8" w:tplc="04090005" w:tentative="1">
+      <w:start w:val="1"/>
+      <w:numFmt w:val="bullet"/>
+      <w:lvlText w:val=""/>
+      <w:lvlJc w:val="left"/>
+      <w:pPr>
+        <w:ind w:left="6480" w:hanging="360"/>
+      </w:pPr>
+      <w:rPr>
+        <w:rFonts w:ascii="Wingdings" w:hAnsi="Wingdings" w:hint="default"/>
+      </w:rPr>
+    </w:lvl>
+  </w:abstractNum>
+  <w:abstractNum w:abstractNumId="18" w15:restartNumberingAfterBreak="0">
+    <w:nsid w:val="527A4BDD"/>
+    <w:multiLevelType w:val="hybridMultilevel"/>
+    <w:tmpl w:val="4E163374"/>
+    <w:lvl w:ilvl="0" w:tplc="0409000F">
+      <w:start w:val="1"/>
+      <w:numFmt w:val="decimal"/>
+      <w:lvlText w:val="%1."/>
+      <w:lvlJc w:val="left"/>
+      <w:pPr>
+        <w:ind w:left="720" w:hanging="360"/>
+      </w:pPr>
+    </w:lvl>
+    <w:lvl w:ilvl="1" w:tplc="04090019" w:tentative="1">
+      <w:start w:val="1"/>
+      <w:numFmt w:val="lowerLetter"/>
+      <w:lvlText w:val="%2."/>
+      <w:lvlJc w:val="left"/>
+      <w:pPr>
+        <w:ind w:left="1440" w:hanging="360"/>
+      </w:pPr>
+    </w:lvl>
+    <w:lvl w:ilvl="2" w:tplc="0409001B" w:tentative="1">
+      <w:start w:val="1"/>
+      <w:numFmt w:val="lowerRoman"/>
+      <w:lvlText w:val="%3."/>
+      <w:lvlJc w:val="right"/>
+      <w:pPr>
+        <w:ind w:left="2160" w:hanging="180"/>
+      </w:pPr>
+    </w:lvl>
+    <w:lvl w:ilvl="3" w:tplc="0409000F" w:tentative="1">
+      <w:start w:val="1"/>
+      <w:numFmt w:val="decimal"/>
+      <w:lvlText w:val="%4."/>
+      <w:lvlJc w:val="left"/>
+      <w:pPr>
+        <w:ind w:left="2880" w:hanging="360"/>
+      </w:pPr>
+    </w:lvl>
+    <w:lvl w:ilvl="4" w:tplc="04090019" w:tentative="1">
+      <w:start w:val="1"/>
+      <w:numFmt w:val="lowerLetter"/>
+      <w:lvlText w:val="%5."/>
+      <w:lvlJc w:val="left"/>
+      <w:pPr>
+        <w:ind w:left="3600" w:hanging="360"/>
+      </w:pPr>
+    </w:lvl>
+    <w:lvl w:ilvl="5" w:tplc="0409001B" w:tentative="1">
+      <w:start w:val="1"/>
+      <w:numFmt w:val="lowerRoman"/>
+      <w:lvlText w:val="%6."/>
+      <w:lvlJc w:val="right"/>
+      <w:pPr>
+        <w:ind w:left="4320" w:hanging="180"/>
+      </w:pPr>
+    </w:lvl>
+    <w:lvl w:ilvl="6" w:tplc="0409000F" w:tentative="1">
+      <w:start w:val="1"/>
+      <w:numFmt w:val="decimal"/>
+      <w:lvlText w:val="%7."/>
+      <w:lvlJc w:val="left"/>
+      <w:pPr>
+        <w:ind w:left="5040" w:hanging="360"/>
+      </w:pPr>
+    </w:lvl>
+    <w:lvl w:ilvl="7" w:tplc="04090019" w:tentative="1">
+      <w:start w:val="1"/>
+      <w:numFmt w:val="lowerLetter"/>
+      <w:lvlText w:val="%8."/>
+      <w:lvlJc w:val="left"/>
+      <w:pPr>
+        <w:ind w:left="5760" w:hanging="360"/>
+      </w:pPr>
+    </w:lvl>
+    <w:lvl w:ilvl="8" w:tplc="0409001B" w:tentative="1">
+      <w:start w:val="1"/>
+      <w:numFmt w:val="lowerRoman"/>
+      <w:lvlText w:val="%9."/>
+      <w:lvlJc w:val="right"/>
+      <w:pPr>
+        <w:ind w:left="6480" w:hanging="180"/>
+      </w:pPr>
+    </w:lvl>
+  </w:abstractNum>
+  <w:abstractNum w:abstractNumId="19" w15:restartNumberingAfterBreak="0">
     <w:nsid w:val="5AD016E7"/>
     <w:multiLevelType w:val="hybridMultilevel"/>
     <w:tmpl w:val="AD6EC9B8"/>
@@ -1294,7 +2337,7 @@
       </w:rPr>
     </w:lvl>
   </w:abstractNum>
-  <w:abstractNum w:abstractNumId="14" w15:restartNumberingAfterBreak="0">
+  <w:abstractNum w:abstractNumId="20" w15:restartNumberingAfterBreak="0">
     <w:nsid w:val="61DA4160"/>
     <w:multiLevelType w:val="hybridMultilevel"/>
     <w:tmpl w:val="90802C16"/>
@@ -1407,7 +2450,7 @@
       </w:rPr>
     </w:lvl>
   </w:abstractNum>
-  <w:abstractNum w:abstractNumId="15" w15:restartNumberingAfterBreak="0">
+  <w:abstractNum w:abstractNumId="21" w15:restartNumberingAfterBreak="0">
     <w:nsid w:val="64584A6E"/>
     <w:multiLevelType w:val="hybridMultilevel"/>
     <w:tmpl w:val="4FC6E9DA"/>
@@ -1520,7 +2563,156 @@
       </w:rPr>
     </w:lvl>
   </w:abstractNum>
-  <w:abstractNum w:abstractNumId="16" w15:restartNumberingAfterBreak="0">
+  <w:abstractNum w:abstractNumId="22" w15:restartNumberingAfterBreak="0">
+    <w:nsid w:val="66772807"/>
+    <w:multiLevelType w:val="multilevel"/>
+    <w:tmpl w:val="816C85E6"/>
+    <w:lvl w:ilvl="0">
+      <w:start w:val="1"/>
+      <w:numFmt w:val="bullet"/>
+      <w:lvlText w:val=""/>
+      <w:lvlJc w:val="left"/>
+      <w:pPr>
+        <w:tabs>
+          <w:tab w:val="num" w:pos="720"/>
+        </w:tabs>
+        <w:ind w:left="720" w:hanging="360"/>
+      </w:pPr>
+      <w:rPr>
+        <w:rFonts w:ascii="Symbol" w:hAnsi="Symbol" w:hint="default"/>
+        <w:sz w:val="20"/>
+      </w:rPr>
+    </w:lvl>
+    <w:lvl w:ilvl="1" w:tentative="1">
+      <w:start w:val="1"/>
+      <w:numFmt w:val="bullet"/>
+      <w:lvlText w:val="o"/>
+      <w:lvlJc w:val="left"/>
+      <w:pPr>
+        <w:tabs>
+          <w:tab w:val="num" w:pos="1440"/>
+        </w:tabs>
+        <w:ind w:left="1440" w:hanging="360"/>
+      </w:pPr>
+      <w:rPr>
+        <w:rFonts w:ascii="Courier New" w:hAnsi="Courier New" w:hint="default"/>
+        <w:sz w:val="20"/>
+      </w:rPr>
+    </w:lvl>
+    <w:lvl w:ilvl="2" w:tentative="1">
+      <w:start w:val="1"/>
+      <w:numFmt w:val="bullet"/>
+      <w:lvlText w:val=""/>
+      <w:lvlJc w:val="left"/>
+      <w:pPr>
+        <w:tabs>
+          <w:tab w:val="num" w:pos="2160"/>
+        </w:tabs>
+        <w:ind w:left="2160" w:hanging="360"/>
+      </w:pPr>
+      <w:rPr>
+        <w:rFonts w:ascii="Wingdings" w:hAnsi="Wingdings" w:hint="default"/>
+        <w:sz w:val="20"/>
+      </w:rPr>
+    </w:lvl>
+    <w:lvl w:ilvl="3" w:tentative="1">
+      <w:start w:val="1"/>
+      <w:numFmt w:val="bullet"/>
+      <w:lvlText w:val=""/>
+      <w:lvlJc w:val="left"/>
+      <w:pPr>
+        <w:tabs>
+          <w:tab w:val="num" w:pos="2880"/>
+        </w:tabs>
+        <w:ind w:left="2880" w:hanging="360"/>
+      </w:pPr>
+      <w:rPr>
+        <w:rFonts w:ascii="Wingdings" w:hAnsi="Wingdings" w:hint="default"/>
+        <w:sz w:val="20"/>
+      </w:rPr>
+    </w:lvl>
+    <w:lvl w:ilvl="4" w:tentative="1">
+      <w:start w:val="1"/>
+      <w:numFmt w:val="bullet"/>
+      <w:lvlText w:val=""/>
+      <w:lvlJc w:val="left"/>
+      <w:pPr>
+        <w:tabs>
+          <w:tab w:val="num" w:pos="3600"/>
+        </w:tabs>
+        <w:ind w:left="3600" w:hanging="360"/>
+      </w:pPr>
+      <w:rPr>
+        <w:rFonts w:ascii="Wingdings" w:hAnsi="Wingdings" w:hint="default"/>
+        <w:sz w:val="20"/>
+      </w:rPr>
+    </w:lvl>
+    <w:lvl w:ilvl="5" w:tentative="1">
+      <w:start w:val="1"/>
+      <w:numFmt w:val="bullet"/>
+      <w:lvlText w:val=""/>
+      <w:lvlJc w:val="left"/>
+      <w:pPr>
+        <w:tabs>
+          <w:tab w:val="num" w:pos="4320"/>
+        </w:tabs>
+        <w:ind w:left="4320" w:hanging="360"/>
+      </w:pPr>
+      <w:rPr>
+        <w:rFonts w:ascii="Wingdings" w:hAnsi="Wingdings" w:hint="default"/>
+        <w:sz w:val="20"/>
+      </w:rPr>
+    </w:lvl>
+    <w:lvl w:ilvl="6" w:tentative="1">
+      <w:start w:val="1"/>
+      <w:numFmt w:val="bullet"/>
+      <w:lvlText w:val=""/>
+      <w:lvlJc w:val="left"/>
+      <w:pPr>
+        <w:tabs>
+          <w:tab w:val="num" w:pos="5040"/>
+        </w:tabs>
+        <w:ind w:left="5040" w:hanging="360"/>
+      </w:pPr>
+      <w:rPr>
+        <w:rFonts w:ascii="Wingdings" w:hAnsi="Wingdings" w:hint="default"/>
+        <w:sz w:val="20"/>
+      </w:rPr>
+    </w:lvl>
+    <w:lvl w:ilvl="7" w:tentative="1">
+      <w:start w:val="1"/>
+      <w:numFmt w:val="bullet"/>
+      <w:lvlText w:val=""/>
+      <w:lvlJc w:val="left"/>
+      <w:pPr>
+        <w:tabs>
+          <w:tab w:val="num" w:pos="5760"/>
+        </w:tabs>
+        <w:ind w:left="5760" w:hanging="360"/>
+      </w:pPr>
+      <w:rPr>
+        <w:rFonts w:ascii="Wingdings" w:hAnsi="Wingdings" w:hint="default"/>
+        <w:sz w:val="20"/>
+      </w:rPr>
+    </w:lvl>
+    <w:lvl w:ilvl="8" w:tentative="1">
+      <w:start w:val="1"/>
+      <w:numFmt w:val="bullet"/>
+      <w:lvlText w:val=""/>
+      <w:lvlJc w:val="left"/>
+      <w:pPr>
+        <w:tabs>
+          <w:tab w:val="num" w:pos="6480"/>
+        </w:tabs>
+        <w:ind w:left="6480" w:hanging="360"/>
+      </w:pPr>
+      <w:rPr>
+        <w:rFonts w:ascii="Wingdings" w:hAnsi="Wingdings" w:hint="default"/>
+        <w:sz w:val="20"/>
+      </w:rPr>
+    </w:lvl>
+  </w:abstractNum>
+  <w:abstractNum w:abstractNumId="23" w15:restartNumberingAfterBreak="0">
     <w:nsid w:val="670E478C"/>
     <w:multiLevelType w:val="hybridMultilevel"/>
     <w:tmpl w:val="2F6E1EEA"/>
@@ -1633,7 +2825,7 @@
       </w:rPr>
     </w:lvl>
   </w:abstractNum>
-  <w:abstractNum w:abstractNumId="17" w15:restartNumberingAfterBreak="0">
+  <w:abstractNum w:abstractNumId="24" w15:restartNumberingAfterBreak="0">
     <w:nsid w:val="680260DE"/>
     <w:multiLevelType w:val="hybridMultilevel"/>
     <w:tmpl w:val="E3EEC270"/>
@@ -1745,7 +2937,7 @@
       </w:rPr>
     </w:lvl>
   </w:abstractNum>
-  <w:abstractNum w:abstractNumId="18" w15:restartNumberingAfterBreak="0">
+  <w:abstractNum w:abstractNumId="25" w15:restartNumberingAfterBreak="0">
     <w:nsid w:val="688870A7"/>
     <w:multiLevelType w:val="hybridMultilevel"/>
     <w:tmpl w:val="1B6C641E"/>
@@ -1857,7 +3049,7 @@
       </w:rPr>
     </w:lvl>
   </w:abstractNum>
-  <w:abstractNum w:abstractNumId="19" w15:restartNumberingAfterBreak="0">
+  <w:abstractNum w:abstractNumId="26" w15:restartNumberingAfterBreak="0">
     <w:nsid w:val="6FEC7E95"/>
     <w:multiLevelType w:val="hybridMultilevel"/>
     <w:tmpl w:val="D4403BD4"/>
@@ -1943,7 +3135,7 @@
       </w:pPr>
     </w:lvl>
   </w:abstractNum>
-  <w:abstractNum w:abstractNumId="20" w15:restartNumberingAfterBreak="0">
+  <w:abstractNum w:abstractNumId="27" w15:restartNumberingAfterBreak="0">
     <w:nsid w:val="75BF684E"/>
     <w:multiLevelType w:val="hybridMultilevel"/>
     <w:tmpl w:val="92ECD91C"/>
@@ -2056,7 +3248,7 @@
       </w:rPr>
     </w:lvl>
   </w:abstractNum>
-  <w:abstractNum w:abstractNumId="21" w15:restartNumberingAfterBreak="0">
+  <w:abstractNum w:abstractNumId="28" w15:restartNumberingAfterBreak="0">
     <w:nsid w:val="7C046A4C"/>
     <w:multiLevelType w:val="hybridMultilevel"/>
     <w:tmpl w:val="7B7828EA"/>
@@ -2169,7 +3361,7 @@
       </w:rPr>
     </w:lvl>
   </w:abstractNum>
-  <w:abstractNum w:abstractNumId="22" w15:restartNumberingAfterBreak="0">
+  <w:abstractNum w:abstractNumId="29" w15:restartNumberingAfterBreak="0">
     <w:nsid w:val="7DB96BC3"/>
     <w:multiLevelType w:val="hybridMultilevel"/>
     <w:tmpl w:val="9ED6E0C0"/>
@@ -2310,46 +3502,67 @@
     <w:abstractNumId w:val="0"/>
   </w:num>
   <w:num w:numId="10" w16cid:durableId="106511336">
+    <w:abstractNumId w:val="28"/>
+  </w:num>
+  <w:num w:numId="11" w16cid:durableId="767696050">
+    <w:abstractNumId w:val="11"/>
+  </w:num>
+  <w:num w:numId="12" w16cid:durableId="245650649">
+    <w:abstractNumId w:val="25"/>
+  </w:num>
+  <w:num w:numId="13" w16cid:durableId="1883326798">
+    <w:abstractNumId w:val="24"/>
+  </w:num>
+  <w:num w:numId="14" w16cid:durableId="1853568935">
+    <w:abstractNumId w:val="29"/>
+  </w:num>
+  <w:num w:numId="15" w16cid:durableId="530187109">
+    <w:abstractNumId w:val="27"/>
+  </w:num>
+  <w:num w:numId="16" w16cid:durableId="552887729">
+    <w:abstractNumId w:val="23"/>
+  </w:num>
+  <w:num w:numId="17" w16cid:durableId="412120092">
     <w:abstractNumId w:val="21"/>
   </w:num>
-  <w:num w:numId="11" w16cid:durableId="767696050">
+  <w:num w:numId="18" w16cid:durableId="89274343">
+    <w:abstractNumId w:val="19"/>
+  </w:num>
+  <w:num w:numId="19" w16cid:durableId="448283815">
+    <w:abstractNumId w:val="14"/>
+  </w:num>
+  <w:num w:numId="20" w16cid:durableId="1041520630">
+    <w:abstractNumId w:val="20"/>
+  </w:num>
+  <w:num w:numId="21" w16cid:durableId="1746876029">
     <w:abstractNumId w:val="10"/>
   </w:num>
-  <w:num w:numId="12" w16cid:durableId="245650649">
+  <w:num w:numId="22" w16cid:durableId="616640340">
+    <w:abstractNumId w:val="26"/>
+  </w:num>
+  <w:num w:numId="23" w16cid:durableId="1614432541">
+    <w:abstractNumId w:val="12"/>
+  </w:num>
+  <w:num w:numId="24" w16cid:durableId="74517583">
     <w:abstractNumId w:val="18"/>
   </w:num>
-  <w:num w:numId="13" w16cid:durableId="1883326798">
-    <w:abstractNumId w:val="17"/>
+  <w:num w:numId="25" w16cid:durableId="1898738452">
+    <w:abstractNumId w:val="9"/>
   </w:num>
-  <w:num w:numId="14" w16cid:durableId="1853568935">
+  <w:num w:numId="26" w16cid:durableId="485783924">
+    <w:abstractNumId w:val="13"/>
+  </w:num>
+  <w:num w:numId="27" w16cid:durableId="732968244">
     <w:abstractNumId w:val="22"/>
   </w:num>
-  <w:num w:numId="15" w16cid:durableId="530187109">
-    <w:abstractNumId w:val="20"/>
-  </w:num>
-  <w:num w:numId="16" w16cid:durableId="552887729">
+  <w:num w:numId="28" w16cid:durableId="1958484916">
     <w:abstractNumId w:val="16"/>
   </w:num>
-  <w:num w:numId="17" w16cid:durableId="412120092">
+  <w:num w:numId="29" w16cid:durableId="1051272482">
     <w:abstractNumId w:val="15"/>
   </w:num>
-  <w:num w:numId="18" w16cid:durableId="89274343">
-    <w:abstractNumId w:val="13"/>
-  </w:num>
-  <w:num w:numId="19" w16cid:durableId="448283815">
-    <w:abstractNumId w:val="12"/>
-  </w:num>
-  <w:num w:numId="20" w16cid:durableId="1041520630">
-    <w:abstractNumId w:val="14"/>
-  </w:num>
-  <w:num w:numId="21" w16cid:durableId="1746876029">
-    <w:abstractNumId w:val="9"/>
-  </w:num>
-  <w:num w:numId="22" w16cid:durableId="616640340">
-    <w:abstractNumId w:val="19"/>
-  </w:num>
-  <w:num w:numId="23" w16cid:durableId="1614432541">
-    <w:abstractNumId w:val="11"/>
+  <w:num w:numId="30" w16cid:durableId="2055419575">
+    <w:abstractNumId w:val="17"/>
   </w:num>
 </w:numbering>
 </file>
@@ -2957,7 +4170,6 @@
   <w:style w:type="character" w:default="1" w:styleId="DefaultParagraphFont">
     <w:name w:val="Default Paragraph Font"/>
     <w:uiPriority w:val="1"/>
-    <w:semiHidden/>
     <w:unhideWhenUsed/>
   </w:style>
   <w:style w:type="table" w:default="1" w:styleId="TableNormal">

</xml_diff>